<commit_message>
saved abstration - js
</commit_message>
<xml_diff>
--- a/03. 12. OOPS_javascript.docx
+++ b/03. 12. OOPS_javascript.docx
@@ -16388,6 +16388,882 @@
       </w:r>
     </w:p>
     <w:p/>
+    <w:p>
+      <w:pPr>
+        <w:rPr>
+          <w:b/>
+          <w:bCs/>
+          <w:color w:val="BF8F00" w:themeColor="accent4" w:themeShade="BF"/>
+          <w:sz w:val="28"/>
+          <w:szCs w:val="28"/>
+        </w:rPr>
+      </w:pPr>
+      <w:r>
+        <w:rPr>
+          <w:b/>
+          <w:bCs/>
+          <w:color w:val="BF8F00" w:themeColor="accent4" w:themeShade="BF"/>
+          <w:sz w:val="28"/>
+          <w:szCs w:val="28"/>
+        </w:rPr>
+        <w:t>Abstraction</w:t>
+      </w:r>
+    </w:p>
+    <w:p>
+      <w:pPr>
+        <w:spacing w:after="0" w:line="240" w:lineRule="auto"/>
+        <w:rPr>
+          <w:lang w:val="en-IN"/>
+        </w:rPr>
+      </w:pPr>
+      <w:r>
+        <w:rPr>
+          <w:lang w:val="en-IN"/>
+        </w:rPr>
+        <w:lastRenderedPageBreak/>
+        <w:t>H</w:t>
+      </w:r>
+      <w:r>
+        <w:rPr>
+          <w:lang w:val="en-IN"/>
+        </w:rPr>
+        <w:t>inding the implementation</w:t>
+      </w:r>
+    </w:p>
+    <w:p/>
+    <w:tbl>
+      <w:tblPr>
+        <w:tblStyle w:val="TableGrid"/>
+        <w:tblW w:w="0" w:type="auto"/>
+        <w:tblLook w:val="04A0" w:firstRow="1" w:lastRow="0" w:firstColumn="1" w:lastColumn="0" w:noHBand="0" w:noVBand="1"/>
+      </w:tblPr>
+      <w:tblGrid>
+        <w:gridCol w:w="9350"/>
+      </w:tblGrid>
+      <w:tr>
+        <w:tc>
+          <w:tcPr>
+            <w:tcW w:w="9350" w:type="dxa"/>
+          </w:tcPr>
+          <w:p>
+            <w:pPr>
+              <w:shd w:val="clear" w:color="auto" w:fill="121314"/>
+              <w:spacing w:line="285" w:lineRule="atLeast"/>
+              <w:rPr>
+                <w:rFonts w:ascii="Consolas" w:eastAsia="Times New Roman" w:hAnsi="Consolas" w:cs="Times New Roman"/>
+                <w:color w:val="BBBEBF"/>
+                <w:kern w:val="0"/>
+                <w:sz w:val="21"/>
+                <w:szCs w:val="21"/>
+                <w:lang w:val="en-IN" w:eastAsia="en-IN"/>
+                <w14:ligatures w14:val="none"/>
+              </w:rPr>
+            </w:pPr>
+            <w:r>
+              <w:rPr>
+                <w:rFonts w:ascii="Consolas" w:eastAsia="Times New Roman" w:hAnsi="Consolas" w:cs="Times New Roman"/>
+                <w:color w:val="FF7B72"/>
+                <w:kern w:val="0"/>
+                <w:sz w:val="21"/>
+                <w:szCs w:val="21"/>
+                <w:lang w:val="en-IN" w:eastAsia="en-IN"/>
+                <w14:ligatures w14:val="none"/>
+              </w:rPr>
+              <w:t>class</w:t>
+            </w:r>
+            <w:r>
+              <w:rPr>
+                <w:rFonts w:ascii="Consolas" w:eastAsia="Times New Roman" w:hAnsi="Consolas" w:cs="Times New Roman"/>
+                <w:color w:val="BBBEBF"/>
+                <w:kern w:val="0"/>
+                <w:sz w:val="21"/>
+                <w:szCs w:val="21"/>
+                <w:lang w:val="en-IN" w:eastAsia="en-IN"/>
+                <w14:ligatures w14:val="none"/>
+              </w:rPr>
+              <w:t xml:space="preserve"> </w:t>
+            </w:r>
+            <w:proofErr w:type="spellStart"/>
+            <w:r>
+              <w:rPr>
+                <w:rFonts w:ascii="Consolas" w:eastAsia="Times New Roman" w:hAnsi="Consolas" w:cs="Times New Roman"/>
+                <w:color w:val="4EC9B0"/>
+                <w:kern w:val="0"/>
+                <w:sz w:val="21"/>
+                <w:szCs w:val="21"/>
+                <w:lang w:val="en-IN" w:eastAsia="en-IN"/>
+                <w14:ligatures w14:val="none"/>
+              </w:rPr>
+              <w:t>coffeeMachine</w:t>
+            </w:r>
+            <w:proofErr w:type="spellEnd"/>
+            <w:r>
+              <w:rPr>
+                <w:rFonts w:ascii="Consolas" w:eastAsia="Times New Roman" w:hAnsi="Consolas" w:cs="Times New Roman"/>
+                <w:color w:val="BBBEBF"/>
+                <w:kern w:val="0"/>
+                <w:sz w:val="21"/>
+                <w:szCs w:val="21"/>
+                <w:lang w:val="en-IN" w:eastAsia="en-IN"/>
+                <w14:ligatures w14:val="none"/>
+              </w:rPr>
+              <w:t>{</w:t>
+            </w:r>
+          </w:p>
+          <w:p>
+            <w:pPr>
+              <w:shd w:val="clear" w:color="auto" w:fill="121314"/>
+              <w:spacing w:line="285" w:lineRule="atLeast"/>
+              <w:rPr>
+                <w:rFonts w:ascii="Consolas" w:eastAsia="Times New Roman" w:hAnsi="Consolas" w:cs="Times New Roman"/>
+                <w:color w:val="BBBEBF"/>
+                <w:kern w:val="0"/>
+                <w:sz w:val="21"/>
+                <w:szCs w:val="21"/>
+                <w:lang w:val="en-IN" w:eastAsia="en-IN"/>
+                <w14:ligatures w14:val="none"/>
+              </w:rPr>
+            </w:pPr>
+            <w:r>
+              <w:rPr>
+                <w:rFonts w:ascii="Consolas" w:eastAsia="Times New Roman" w:hAnsi="Consolas" w:cs="Times New Roman"/>
+                <w:color w:val="BBBEBF"/>
+                <w:kern w:val="0"/>
+                <w:sz w:val="21"/>
+                <w:szCs w:val="21"/>
+                <w:lang w:val="en-IN" w:eastAsia="en-IN"/>
+                <w14:ligatures w14:val="none"/>
+              </w:rPr>
+              <w:t>    #</w:t>
+            </w:r>
+            <w:r>
+              <w:rPr>
+                <w:rFonts w:ascii="Consolas" w:eastAsia="Times New Roman" w:hAnsi="Consolas" w:cs="Times New Roman"/>
+                <w:color w:val="D2A8FF"/>
+                <w:kern w:val="0"/>
+                <w:sz w:val="21"/>
+                <w:szCs w:val="21"/>
+                <w:lang w:val="en-IN" w:eastAsia="en-IN"/>
+                <w14:ligatures w14:val="none"/>
+              </w:rPr>
+              <w:t>boilWater</w:t>
+            </w:r>
+            <w:r>
+              <w:rPr>
+                <w:rFonts w:ascii="Consolas" w:eastAsia="Times New Roman" w:hAnsi="Consolas" w:cs="Times New Roman"/>
+                <w:color w:val="BBBEBF"/>
+                <w:kern w:val="0"/>
+                <w:sz w:val="21"/>
+                <w:szCs w:val="21"/>
+                <w:lang w:val="en-IN" w:eastAsia="en-IN"/>
+                <w14:ligatures w14:val="none"/>
+              </w:rPr>
+              <w:t>()</w:t>
+            </w:r>
+            <w:r>
+              <w:rPr>
+                <w:rFonts w:ascii="Consolas" w:eastAsia="Times New Roman" w:hAnsi="Consolas" w:cs="Times New Roman"/>
+                <w:color w:val="C9D1D9"/>
+                <w:kern w:val="0"/>
+                <w:sz w:val="21"/>
+                <w:szCs w:val="21"/>
+                <w:lang w:val="en-IN" w:eastAsia="en-IN"/>
+                <w14:ligatures w14:val="none"/>
+              </w:rPr>
+              <w:t>{</w:t>
+            </w:r>
+          </w:p>
+          <w:p>
+            <w:pPr>
+              <w:shd w:val="clear" w:color="auto" w:fill="121314"/>
+              <w:spacing w:line="285" w:lineRule="atLeast"/>
+              <w:rPr>
+                <w:rFonts w:ascii="Consolas" w:eastAsia="Times New Roman" w:hAnsi="Consolas" w:cs="Times New Roman"/>
+                <w:color w:val="BBBEBF"/>
+                <w:kern w:val="0"/>
+                <w:sz w:val="21"/>
+                <w:szCs w:val="21"/>
+                <w:lang w:val="en-IN" w:eastAsia="en-IN"/>
+                <w14:ligatures w14:val="none"/>
+              </w:rPr>
+            </w:pPr>
+            <w:r>
+              <w:rPr>
+                <w:rFonts w:ascii="Consolas" w:eastAsia="Times New Roman" w:hAnsi="Consolas" w:cs="Times New Roman"/>
+                <w:color w:val="C9D1D9"/>
+                <w:kern w:val="0"/>
+                <w:sz w:val="21"/>
+                <w:szCs w:val="21"/>
+                <w:lang w:val="en-IN" w:eastAsia="en-IN"/>
+                <w14:ligatures w14:val="none"/>
+              </w:rPr>
+              <w:t xml:space="preserve">        </w:t>
+            </w:r>
+            <w:r>
+              <w:rPr>
+                <w:rFonts w:ascii="Consolas" w:eastAsia="Times New Roman" w:hAnsi="Consolas" w:cs="Times New Roman"/>
+                <w:color w:val="79C0FF"/>
+                <w:kern w:val="0"/>
+                <w:sz w:val="21"/>
+                <w:szCs w:val="21"/>
+                <w:lang w:val="en-IN" w:eastAsia="en-IN"/>
+                <w14:ligatures w14:val="none"/>
+              </w:rPr>
+              <w:t>console</w:t>
+            </w:r>
+            <w:r>
+              <w:rPr>
+                <w:rFonts w:ascii="Consolas" w:eastAsia="Times New Roman" w:hAnsi="Consolas" w:cs="Times New Roman"/>
+                <w:color w:val="C9D1D9"/>
+                <w:kern w:val="0"/>
+                <w:sz w:val="21"/>
+                <w:szCs w:val="21"/>
+                <w:lang w:val="en-IN" w:eastAsia="en-IN"/>
+                <w14:ligatures w14:val="none"/>
+              </w:rPr>
+              <w:t>.</w:t>
+            </w:r>
+            <w:r>
+              <w:rPr>
+                <w:rFonts w:ascii="Consolas" w:eastAsia="Times New Roman" w:hAnsi="Consolas" w:cs="Times New Roman"/>
+                <w:color w:val="D2A8FF"/>
+                <w:kern w:val="0"/>
+                <w:sz w:val="21"/>
+                <w:szCs w:val="21"/>
+                <w:lang w:val="en-IN" w:eastAsia="en-IN"/>
+                <w14:ligatures w14:val="none"/>
+              </w:rPr>
+              <w:t>log</w:t>
+            </w:r>
+            <w:r>
+              <w:rPr>
+                <w:rFonts w:ascii="Consolas" w:eastAsia="Times New Roman" w:hAnsi="Consolas" w:cs="Times New Roman"/>
+                <w:color w:val="C9D1D9"/>
+                <w:kern w:val="0"/>
+                <w:sz w:val="21"/>
+                <w:szCs w:val="21"/>
+                <w:lang w:val="en-IN" w:eastAsia="en-IN"/>
+                <w14:ligatures w14:val="none"/>
+              </w:rPr>
+              <w:t>(</w:t>
+            </w:r>
+            <w:r>
+              <w:rPr>
+                <w:rFonts w:ascii="Consolas" w:eastAsia="Times New Roman" w:hAnsi="Consolas" w:cs="Times New Roman"/>
+                <w:color w:val="A5D6FF"/>
+                <w:kern w:val="0"/>
+                <w:sz w:val="21"/>
+                <w:szCs w:val="21"/>
+                <w:lang w:val="en-IN" w:eastAsia="en-IN"/>
+                <w14:ligatures w14:val="none"/>
+              </w:rPr>
+              <w:t>'boiling water'</w:t>
+            </w:r>
+            <w:r>
+              <w:rPr>
+                <w:rFonts w:ascii="Consolas" w:eastAsia="Times New Roman" w:hAnsi="Consolas" w:cs="Times New Roman"/>
+                <w:color w:val="C9D1D9"/>
+                <w:kern w:val="0"/>
+                <w:sz w:val="21"/>
+                <w:szCs w:val="21"/>
+                <w:lang w:val="en-IN" w:eastAsia="en-IN"/>
+                <w14:ligatures w14:val="none"/>
+              </w:rPr>
+              <w:t>);</w:t>
+            </w:r>
+          </w:p>
+          <w:p>
+            <w:pPr>
+              <w:shd w:val="clear" w:color="auto" w:fill="121314"/>
+              <w:spacing w:line="285" w:lineRule="atLeast"/>
+              <w:rPr>
+                <w:rFonts w:ascii="Consolas" w:eastAsia="Times New Roman" w:hAnsi="Consolas" w:cs="Times New Roman"/>
+                <w:color w:val="BBBEBF"/>
+                <w:kern w:val="0"/>
+                <w:sz w:val="21"/>
+                <w:szCs w:val="21"/>
+                <w:lang w:val="en-IN" w:eastAsia="en-IN"/>
+                <w14:ligatures w14:val="none"/>
+              </w:rPr>
+            </w:pPr>
+            <w:r>
+              <w:rPr>
+                <w:rFonts w:ascii="Consolas" w:eastAsia="Times New Roman" w:hAnsi="Consolas" w:cs="Times New Roman"/>
+                <w:color w:val="C9D1D9"/>
+                <w:kern w:val="0"/>
+                <w:sz w:val="21"/>
+                <w:szCs w:val="21"/>
+                <w:lang w:val="en-IN" w:eastAsia="en-IN"/>
+                <w14:ligatures w14:val="none"/>
+              </w:rPr>
+              <w:t>    }</w:t>
+            </w:r>
+          </w:p>
+          <w:p>
+            <w:pPr>
+              <w:shd w:val="clear" w:color="auto" w:fill="121314"/>
+              <w:spacing w:line="285" w:lineRule="atLeast"/>
+              <w:rPr>
+                <w:rFonts w:ascii="Consolas" w:eastAsia="Times New Roman" w:hAnsi="Consolas" w:cs="Times New Roman"/>
+                <w:color w:val="BBBEBF"/>
+                <w:kern w:val="0"/>
+                <w:sz w:val="21"/>
+                <w:szCs w:val="21"/>
+                <w:lang w:val="en-IN" w:eastAsia="en-IN"/>
+                <w14:ligatures w14:val="none"/>
+              </w:rPr>
+            </w:pPr>
+            <w:r>
+              <w:rPr>
+                <w:rFonts w:ascii="Consolas" w:eastAsia="Times New Roman" w:hAnsi="Consolas" w:cs="Times New Roman"/>
+                <w:color w:val="BBBEBF"/>
+                <w:kern w:val="0"/>
+                <w:sz w:val="21"/>
+                <w:szCs w:val="21"/>
+                <w:lang w:val="en-IN" w:eastAsia="en-IN"/>
+                <w14:ligatures w14:val="none"/>
+              </w:rPr>
+              <w:t xml:space="preserve">    </w:t>
+            </w:r>
+            <w:proofErr w:type="spellStart"/>
+            <w:r>
+              <w:rPr>
+                <w:rFonts w:ascii="Consolas" w:eastAsia="Times New Roman" w:hAnsi="Consolas" w:cs="Times New Roman"/>
+                <w:color w:val="D2A8FF"/>
+                <w:kern w:val="0"/>
+                <w:sz w:val="21"/>
+                <w:szCs w:val="21"/>
+                <w:lang w:val="en-IN" w:eastAsia="en-IN"/>
+                <w14:ligatures w14:val="none"/>
+              </w:rPr>
+              <w:t>makeCoffee</w:t>
+            </w:r>
+            <w:proofErr w:type="spellEnd"/>
+            <w:r>
+              <w:rPr>
+                <w:rFonts w:ascii="Consolas" w:eastAsia="Times New Roman" w:hAnsi="Consolas" w:cs="Times New Roman"/>
+                <w:color w:val="BBBEBF"/>
+                <w:kern w:val="0"/>
+                <w:sz w:val="21"/>
+                <w:szCs w:val="21"/>
+                <w:lang w:val="en-IN" w:eastAsia="en-IN"/>
+                <w14:ligatures w14:val="none"/>
+              </w:rPr>
+              <w:t>()</w:t>
+            </w:r>
+            <w:r>
+              <w:rPr>
+                <w:rFonts w:ascii="Consolas" w:eastAsia="Times New Roman" w:hAnsi="Consolas" w:cs="Times New Roman"/>
+                <w:color w:val="C9D1D9"/>
+                <w:kern w:val="0"/>
+                <w:sz w:val="21"/>
+                <w:szCs w:val="21"/>
+                <w:lang w:val="en-IN" w:eastAsia="en-IN"/>
+                <w14:ligatures w14:val="none"/>
+              </w:rPr>
+              <w:t>{</w:t>
+            </w:r>
+          </w:p>
+          <w:p>
+            <w:pPr>
+              <w:shd w:val="clear" w:color="auto" w:fill="121314"/>
+              <w:spacing w:line="285" w:lineRule="atLeast"/>
+              <w:rPr>
+                <w:rFonts w:ascii="Consolas" w:eastAsia="Times New Roman" w:hAnsi="Consolas" w:cs="Times New Roman"/>
+                <w:color w:val="BBBEBF"/>
+                <w:kern w:val="0"/>
+                <w:sz w:val="21"/>
+                <w:szCs w:val="21"/>
+                <w:lang w:val="en-IN" w:eastAsia="en-IN"/>
+                <w14:ligatures w14:val="none"/>
+              </w:rPr>
+            </w:pPr>
+            <w:r>
+              <w:rPr>
+                <w:rFonts w:ascii="Consolas" w:eastAsia="Times New Roman" w:hAnsi="Consolas" w:cs="Times New Roman"/>
+                <w:color w:val="C9D1D9"/>
+                <w:kern w:val="0"/>
+                <w:sz w:val="21"/>
+                <w:szCs w:val="21"/>
+                <w:lang w:val="en-IN" w:eastAsia="en-IN"/>
+                <w14:ligatures w14:val="none"/>
+              </w:rPr>
+              <w:t xml:space="preserve">        </w:t>
+            </w:r>
+            <w:r>
+              <w:rPr>
+                <w:rFonts w:ascii="Consolas" w:eastAsia="Times New Roman" w:hAnsi="Consolas" w:cs="Times New Roman"/>
+                <w:color w:val="79C0FF"/>
+                <w:kern w:val="0"/>
+                <w:sz w:val="21"/>
+                <w:szCs w:val="21"/>
+                <w:lang w:val="en-IN" w:eastAsia="en-IN"/>
+                <w14:ligatures w14:val="none"/>
+              </w:rPr>
+              <w:t>this</w:t>
+            </w:r>
+            <w:r>
+              <w:rPr>
+                <w:rFonts w:ascii="Consolas" w:eastAsia="Times New Roman" w:hAnsi="Consolas" w:cs="Times New Roman"/>
+                <w:color w:val="C9D1D9"/>
+                <w:kern w:val="0"/>
+                <w:sz w:val="21"/>
+                <w:szCs w:val="21"/>
+                <w:lang w:val="en-IN" w:eastAsia="en-IN"/>
+                <w14:ligatures w14:val="none"/>
+              </w:rPr>
+              <w:t>.</w:t>
+            </w:r>
+            <w:r>
+              <w:rPr>
+                <w:rFonts w:ascii="Consolas" w:eastAsia="Times New Roman" w:hAnsi="Consolas" w:cs="Times New Roman"/>
+                <w:color w:val="D2A8FF"/>
+                <w:kern w:val="0"/>
+                <w:sz w:val="21"/>
+                <w:szCs w:val="21"/>
+                <w:lang w:val="en-IN" w:eastAsia="en-IN"/>
+                <w14:ligatures w14:val="none"/>
+              </w:rPr>
+              <w:t>#</w:t>
+            </w:r>
+            <w:proofErr w:type="spellStart"/>
+            <w:r>
+              <w:rPr>
+                <w:rFonts w:ascii="Consolas" w:eastAsia="Times New Roman" w:hAnsi="Consolas" w:cs="Times New Roman"/>
+                <w:color w:val="D2A8FF"/>
+                <w:kern w:val="0"/>
+                <w:sz w:val="21"/>
+                <w:szCs w:val="21"/>
+                <w:lang w:val="en-IN" w:eastAsia="en-IN"/>
+                <w14:ligatures w14:val="none"/>
+              </w:rPr>
+              <w:t>boilWater</w:t>
+            </w:r>
+            <w:proofErr w:type="spellEnd"/>
+            <w:r>
+              <w:rPr>
+                <w:rFonts w:ascii="Consolas" w:eastAsia="Times New Roman" w:hAnsi="Consolas" w:cs="Times New Roman"/>
+                <w:color w:val="C9D1D9"/>
+                <w:kern w:val="0"/>
+                <w:sz w:val="21"/>
+                <w:szCs w:val="21"/>
+                <w:lang w:val="en-IN" w:eastAsia="en-IN"/>
+                <w14:ligatures w14:val="none"/>
+              </w:rPr>
+              <w:t>();</w:t>
+            </w:r>
+          </w:p>
+          <w:p>
+            <w:pPr>
+              <w:shd w:val="clear" w:color="auto" w:fill="121314"/>
+              <w:spacing w:line="285" w:lineRule="atLeast"/>
+              <w:rPr>
+                <w:rFonts w:ascii="Consolas" w:eastAsia="Times New Roman" w:hAnsi="Consolas" w:cs="Times New Roman"/>
+                <w:color w:val="BBBEBF"/>
+                <w:kern w:val="0"/>
+                <w:sz w:val="21"/>
+                <w:szCs w:val="21"/>
+                <w:lang w:val="en-IN" w:eastAsia="en-IN"/>
+                <w14:ligatures w14:val="none"/>
+              </w:rPr>
+            </w:pPr>
+            <w:r>
+              <w:rPr>
+                <w:rFonts w:ascii="Consolas" w:eastAsia="Times New Roman" w:hAnsi="Consolas" w:cs="Times New Roman"/>
+                <w:color w:val="C9D1D9"/>
+                <w:kern w:val="0"/>
+                <w:sz w:val="21"/>
+                <w:szCs w:val="21"/>
+                <w:lang w:val="en-IN" w:eastAsia="en-IN"/>
+                <w14:ligatures w14:val="none"/>
+              </w:rPr>
+              <w:t xml:space="preserve">        </w:t>
+            </w:r>
+            <w:r>
+              <w:rPr>
+                <w:rFonts w:ascii="Consolas" w:eastAsia="Times New Roman" w:hAnsi="Consolas" w:cs="Times New Roman"/>
+                <w:color w:val="79C0FF"/>
+                <w:kern w:val="0"/>
+                <w:sz w:val="21"/>
+                <w:szCs w:val="21"/>
+                <w:lang w:val="en-IN" w:eastAsia="en-IN"/>
+                <w14:ligatures w14:val="none"/>
+              </w:rPr>
+              <w:t>console</w:t>
+            </w:r>
+            <w:r>
+              <w:rPr>
+                <w:rFonts w:ascii="Consolas" w:eastAsia="Times New Roman" w:hAnsi="Consolas" w:cs="Times New Roman"/>
+                <w:color w:val="C9D1D9"/>
+                <w:kern w:val="0"/>
+                <w:sz w:val="21"/>
+                <w:szCs w:val="21"/>
+                <w:lang w:val="en-IN" w:eastAsia="en-IN"/>
+                <w14:ligatures w14:val="none"/>
+              </w:rPr>
+              <w:t>.</w:t>
+            </w:r>
+            <w:r>
+              <w:rPr>
+                <w:rFonts w:ascii="Consolas" w:eastAsia="Times New Roman" w:hAnsi="Consolas" w:cs="Times New Roman"/>
+                <w:color w:val="D2A8FF"/>
+                <w:kern w:val="0"/>
+                <w:sz w:val="21"/>
+                <w:szCs w:val="21"/>
+                <w:lang w:val="en-IN" w:eastAsia="en-IN"/>
+                <w14:ligatures w14:val="none"/>
+              </w:rPr>
+              <w:t>log</w:t>
+            </w:r>
+            <w:r>
+              <w:rPr>
+                <w:rFonts w:ascii="Consolas" w:eastAsia="Times New Roman" w:hAnsi="Consolas" w:cs="Times New Roman"/>
+                <w:color w:val="C9D1D9"/>
+                <w:kern w:val="0"/>
+                <w:sz w:val="21"/>
+                <w:szCs w:val="21"/>
+                <w:lang w:val="en-IN" w:eastAsia="en-IN"/>
+                <w14:ligatures w14:val="none"/>
+              </w:rPr>
+              <w:t>(</w:t>
+            </w:r>
+            <w:r>
+              <w:rPr>
+                <w:rFonts w:ascii="Consolas" w:eastAsia="Times New Roman" w:hAnsi="Consolas" w:cs="Times New Roman"/>
+                <w:color w:val="A5D6FF"/>
+                <w:kern w:val="0"/>
+                <w:sz w:val="21"/>
+                <w:szCs w:val="21"/>
+                <w:lang w:val="en-IN" w:eastAsia="en-IN"/>
+                <w14:ligatures w14:val="none"/>
+              </w:rPr>
+              <w:t>'Coffee is Ready'</w:t>
+            </w:r>
+            <w:r>
+              <w:rPr>
+                <w:rFonts w:ascii="Consolas" w:eastAsia="Times New Roman" w:hAnsi="Consolas" w:cs="Times New Roman"/>
+                <w:color w:val="C9D1D9"/>
+                <w:kern w:val="0"/>
+                <w:sz w:val="21"/>
+                <w:szCs w:val="21"/>
+                <w:lang w:val="en-IN" w:eastAsia="en-IN"/>
+                <w14:ligatures w14:val="none"/>
+              </w:rPr>
+              <w:t>);</w:t>
+            </w:r>
+          </w:p>
+          <w:p>
+            <w:pPr>
+              <w:shd w:val="clear" w:color="auto" w:fill="121314"/>
+              <w:spacing w:line="285" w:lineRule="atLeast"/>
+              <w:rPr>
+                <w:rFonts w:ascii="Consolas" w:eastAsia="Times New Roman" w:hAnsi="Consolas" w:cs="Times New Roman"/>
+                <w:color w:val="BBBEBF"/>
+                <w:kern w:val="0"/>
+                <w:sz w:val="21"/>
+                <w:szCs w:val="21"/>
+                <w:lang w:val="en-IN" w:eastAsia="en-IN"/>
+                <w14:ligatures w14:val="none"/>
+              </w:rPr>
+            </w:pPr>
+            <w:r>
+              <w:rPr>
+                <w:rFonts w:ascii="Consolas" w:eastAsia="Times New Roman" w:hAnsi="Consolas" w:cs="Times New Roman"/>
+                <w:color w:val="C9D1D9"/>
+                <w:kern w:val="0"/>
+                <w:sz w:val="21"/>
+                <w:szCs w:val="21"/>
+                <w:lang w:val="en-IN" w:eastAsia="en-IN"/>
+                <w14:ligatures w14:val="none"/>
+              </w:rPr>
+              <w:t>    }</w:t>
+            </w:r>
+          </w:p>
+          <w:p>
+            <w:pPr>
+              <w:shd w:val="clear" w:color="auto" w:fill="121314"/>
+              <w:spacing w:line="285" w:lineRule="atLeast"/>
+              <w:rPr>
+                <w:rFonts w:ascii="Consolas" w:eastAsia="Times New Roman" w:hAnsi="Consolas" w:cs="Times New Roman"/>
+                <w:color w:val="BBBEBF"/>
+                <w:kern w:val="0"/>
+                <w:sz w:val="21"/>
+                <w:szCs w:val="21"/>
+                <w:lang w:val="en-IN" w:eastAsia="en-IN"/>
+                <w14:ligatures w14:val="none"/>
+              </w:rPr>
+            </w:pPr>
+            <w:r>
+              <w:rPr>
+                <w:rFonts w:ascii="Consolas" w:eastAsia="Times New Roman" w:hAnsi="Consolas" w:cs="Times New Roman"/>
+                <w:color w:val="BBBEBF"/>
+                <w:kern w:val="0"/>
+                <w:sz w:val="21"/>
+                <w:szCs w:val="21"/>
+                <w:lang w:val="en-IN" w:eastAsia="en-IN"/>
+                <w14:ligatures w14:val="none"/>
+              </w:rPr>
+              <w:t>}</w:t>
+            </w:r>
+          </w:p>
+          <w:p>
+            <w:pPr>
+              <w:shd w:val="clear" w:color="auto" w:fill="121314"/>
+              <w:spacing w:line="285" w:lineRule="atLeast"/>
+              <w:rPr>
+                <w:rFonts w:ascii="Consolas" w:eastAsia="Times New Roman" w:hAnsi="Consolas" w:cs="Times New Roman"/>
+                <w:color w:val="BBBEBF"/>
+                <w:kern w:val="0"/>
+                <w:sz w:val="21"/>
+                <w:szCs w:val="21"/>
+                <w:lang w:val="en-IN" w:eastAsia="en-IN"/>
+                <w14:ligatures w14:val="none"/>
+              </w:rPr>
+            </w:pPr>
+          </w:p>
+          <w:p>
+            <w:pPr>
+              <w:shd w:val="clear" w:color="auto" w:fill="121314"/>
+              <w:spacing w:line="285" w:lineRule="atLeast"/>
+              <w:rPr>
+                <w:rFonts w:ascii="Consolas" w:eastAsia="Times New Roman" w:hAnsi="Consolas" w:cs="Times New Roman"/>
+                <w:color w:val="BBBEBF"/>
+                <w:kern w:val="0"/>
+                <w:sz w:val="21"/>
+                <w:szCs w:val="21"/>
+                <w:lang w:val="en-IN" w:eastAsia="en-IN"/>
+                <w14:ligatures w14:val="none"/>
+              </w:rPr>
+            </w:pPr>
+            <w:r>
+              <w:rPr>
+                <w:rFonts w:ascii="Consolas" w:eastAsia="Times New Roman" w:hAnsi="Consolas" w:cs="Times New Roman"/>
+                <w:color w:val="FF7B72"/>
+                <w:kern w:val="0"/>
+                <w:sz w:val="21"/>
+                <w:szCs w:val="21"/>
+                <w:lang w:val="en-IN" w:eastAsia="en-IN"/>
+                <w14:ligatures w14:val="none"/>
+              </w:rPr>
+              <w:t>let</w:t>
+            </w:r>
+            <w:r>
+              <w:rPr>
+                <w:rFonts w:ascii="Consolas" w:eastAsia="Times New Roman" w:hAnsi="Consolas" w:cs="Times New Roman"/>
+                <w:color w:val="BBBEBF"/>
+                <w:kern w:val="0"/>
+                <w:sz w:val="21"/>
+                <w:szCs w:val="21"/>
+                <w:lang w:val="en-IN" w:eastAsia="en-IN"/>
+                <w14:ligatures w14:val="none"/>
+              </w:rPr>
+              <w:t xml:space="preserve"> </w:t>
+            </w:r>
+            <w:proofErr w:type="spellStart"/>
+            <w:r>
+              <w:rPr>
+                <w:rFonts w:ascii="Consolas" w:eastAsia="Times New Roman" w:hAnsi="Consolas" w:cs="Times New Roman"/>
+                <w:color w:val="C9D1D9"/>
+                <w:kern w:val="0"/>
+                <w:sz w:val="21"/>
+                <w:szCs w:val="21"/>
+                <w:lang w:val="en-IN" w:eastAsia="en-IN"/>
+                <w14:ligatures w14:val="none"/>
+              </w:rPr>
+              <w:t>CoffeeObj</w:t>
+            </w:r>
+            <w:proofErr w:type="spellEnd"/>
+            <w:r>
+              <w:rPr>
+                <w:rFonts w:ascii="Consolas" w:eastAsia="Times New Roman" w:hAnsi="Consolas" w:cs="Times New Roman"/>
+                <w:color w:val="D4D4D4"/>
+                <w:kern w:val="0"/>
+                <w:sz w:val="21"/>
+                <w:szCs w:val="21"/>
+                <w:lang w:val="en-IN" w:eastAsia="en-IN"/>
+                <w14:ligatures w14:val="none"/>
+              </w:rPr>
+              <w:t>=</w:t>
+            </w:r>
+            <w:r>
+              <w:rPr>
+                <w:rFonts w:ascii="Consolas" w:eastAsia="Times New Roman" w:hAnsi="Consolas" w:cs="Times New Roman"/>
+                <w:color w:val="569CD6"/>
+                <w:kern w:val="0"/>
+                <w:sz w:val="21"/>
+                <w:szCs w:val="21"/>
+                <w:lang w:val="en-IN" w:eastAsia="en-IN"/>
+                <w14:ligatures w14:val="none"/>
+              </w:rPr>
+              <w:t>new</w:t>
+            </w:r>
+            <w:r>
+              <w:rPr>
+                <w:rFonts w:ascii="Consolas" w:eastAsia="Times New Roman" w:hAnsi="Consolas" w:cs="Times New Roman"/>
+                <w:color w:val="BBBEBF"/>
+                <w:kern w:val="0"/>
+                <w:sz w:val="21"/>
+                <w:szCs w:val="21"/>
+                <w:lang w:val="en-IN" w:eastAsia="en-IN"/>
+                <w14:ligatures w14:val="none"/>
+              </w:rPr>
+              <w:t xml:space="preserve"> </w:t>
+            </w:r>
+            <w:proofErr w:type="spellStart"/>
+            <w:r>
+              <w:rPr>
+                <w:rFonts w:ascii="Consolas" w:eastAsia="Times New Roman" w:hAnsi="Consolas" w:cs="Times New Roman"/>
+                <w:color w:val="4EC9B0"/>
+                <w:kern w:val="0"/>
+                <w:sz w:val="21"/>
+                <w:szCs w:val="21"/>
+                <w:lang w:val="en-IN" w:eastAsia="en-IN"/>
+                <w14:ligatures w14:val="none"/>
+              </w:rPr>
+              <w:t>coffeeMachine</w:t>
+            </w:r>
+            <w:proofErr w:type="spellEnd"/>
+            <w:r>
+              <w:rPr>
+                <w:rFonts w:ascii="Consolas" w:eastAsia="Times New Roman" w:hAnsi="Consolas" w:cs="Times New Roman"/>
+                <w:color w:val="BBBEBF"/>
+                <w:kern w:val="0"/>
+                <w:sz w:val="21"/>
+                <w:szCs w:val="21"/>
+                <w:lang w:val="en-IN" w:eastAsia="en-IN"/>
+                <w14:ligatures w14:val="none"/>
+              </w:rPr>
+              <w:t>();</w:t>
+            </w:r>
+          </w:p>
+          <w:p>
+            <w:pPr>
+              <w:shd w:val="clear" w:color="auto" w:fill="121314"/>
+              <w:spacing w:line="285" w:lineRule="atLeast"/>
+              <w:rPr>
+                <w:rFonts w:ascii="Consolas" w:eastAsia="Times New Roman" w:hAnsi="Consolas" w:cs="Times New Roman"/>
+                <w:color w:val="BBBEBF"/>
+                <w:kern w:val="0"/>
+                <w:sz w:val="21"/>
+                <w:szCs w:val="21"/>
+                <w:lang w:val="en-IN" w:eastAsia="en-IN"/>
+                <w14:ligatures w14:val="none"/>
+              </w:rPr>
+            </w:pPr>
+            <w:proofErr w:type="spellStart"/>
+            <w:r>
+              <w:rPr>
+                <w:rFonts w:ascii="Consolas" w:eastAsia="Times New Roman" w:hAnsi="Consolas" w:cs="Times New Roman"/>
+                <w:color w:val="C9D1D9"/>
+                <w:kern w:val="0"/>
+                <w:sz w:val="21"/>
+                <w:szCs w:val="21"/>
+                <w:lang w:val="en-IN" w:eastAsia="en-IN"/>
+                <w14:ligatures w14:val="none"/>
+              </w:rPr>
+              <w:t>CoffeeObj</w:t>
+            </w:r>
+            <w:r>
+              <w:rPr>
+                <w:rFonts w:ascii="Consolas" w:eastAsia="Times New Roman" w:hAnsi="Consolas" w:cs="Times New Roman"/>
+                <w:color w:val="BBBEBF"/>
+                <w:kern w:val="0"/>
+                <w:sz w:val="21"/>
+                <w:szCs w:val="21"/>
+                <w:lang w:val="en-IN" w:eastAsia="en-IN"/>
+                <w14:ligatures w14:val="none"/>
+              </w:rPr>
+              <w:t>.</w:t>
+            </w:r>
+            <w:r>
+              <w:rPr>
+                <w:rFonts w:ascii="Consolas" w:eastAsia="Times New Roman" w:hAnsi="Consolas" w:cs="Times New Roman"/>
+                <w:color w:val="D2A8FF"/>
+                <w:kern w:val="0"/>
+                <w:sz w:val="21"/>
+                <w:szCs w:val="21"/>
+                <w:lang w:val="en-IN" w:eastAsia="en-IN"/>
+                <w14:ligatures w14:val="none"/>
+              </w:rPr>
+              <w:t>makeCoffee</w:t>
+            </w:r>
+            <w:proofErr w:type="spellEnd"/>
+            <w:r>
+              <w:rPr>
+                <w:rFonts w:ascii="Consolas" w:eastAsia="Times New Roman" w:hAnsi="Consolas" w:cs="Times New Roman"/>
+                <w:color w:val="BBBEBF"/>
+                <w:kern w:val="0"/>
+                <w:sz w:val="21"/>
+                <w:szCs w:val="21"/>
+                <w:lang w:val="en-IN" w:eastAsia="en-IN"/>
+                <w14:ligatures w14:val="none"/>
+              </w:rPr>
+              <w:t>();</w:t>
+            </w:r>
+          </w:p>
+          <w:p>
+            <w:pPr>
+              <w:shd w:val="clear" w:color="auto" w:fill="121314"/>
+              <w:spacing w:line="285" w:lineRule="atLeast"/>
+              <w:rPr>
+                <w:rFonts w:ascii="Consolas" w:eastAsia="Times New Roman" w:hAnsi="Consolas" w:cs="Times New Roman"/>
+                <w:color w:val="BBBEBF"/>
+                <w:kern w:val="0"/>
+                <w:sz w:val="21"/>
+                <w:szCs w:val="21"/>
+                <w:lang w:val="en-IN" w:eastAsia="en-IN"/>
+                <w14:ligatures w14:val="none"/>
+              </w:rPr>
+            </w:pPr>
+            <w:r>
+              <w:rPr>
+                <w:rFonts w:ascii="Consolas" w:eastAsia="Times New Roman" w:hAnsi="Consolas" w:cs="Times New Roman"/>
+                <w:color w:val="8B949E"/>
+                <w:kern w:val="0"/>
+                <w:sz w:val="21"/>
+                <w:szCs w:val="21"/>
+                <w:lang w:val="en-IN" w:eastAsia="en-IN"/>
+                <w14:ligatures w14:val="none"/>
+              </w:rPr>
+              <w:t xml:space="preserve">// </w:t>
+            </w:r>
+            <w:proofErr w:type="spellStart"/>
+            <w:r>
+              <w:rPr>
+                <w:rFonts w:ascii="Consolas" w:eastAsia="Times New Roman" w:hAnsi="Consolas" w:cs="Times New Roman"/>
+                <w:color w:val="8B949E"/>
+                <w:kern w:val="0"/>
+                <w:sz w:val="21"/>
+                <w:szCs w:val="21"/>
+                <w:lang w:val="en-IN" w:eastAsia="en-IN"/>
+                <w14:ligatures w14:val="none"/>
+              </w:rPr>
+              <w:t>CoffeeObj.boilWater</w:t>
+            </w:r>
+            <w:proofErr w:type="spellEnd"/>
+            <w:r>
+              <w:rPr>
+                <w:rFonts w:ascii="Consolas" w:eastAsia="Times New Roman" w:hAnsi="Consolas" w:cs="Times New Roman"/>
+                <w:color w:val="8B949E"/>
+                <w:kern w:val="0"/>
+                <w:sz w:val="21"/>
+                <w:szCs w:val="21"/>
+                <w:lang w:val="en-IN" w:eastAsia="en-IN"/>
+                <w14:ligatures w14:val="none"/>
+              </w:rPr>
+              <w:t>(); //cannot call private method outside the class</w:t>
+            </w:r>
+          </w:p>
+        </w:tc>
+      </w:tr>
+    </w:tbl>
+    <w:p>
+      <w:pPr>
+        <w:rPr>
+          <w:lang w:val="en-IN"/>
+        </w:rPr>
+      </w:pPr>
+    </w:p>
     <w:sectPr>
       <w:pgSz w:w="12240" w:h="15840"/>
       <w:pgMar w:top="1440" w:right="1440" w:bottom="1440" w:left="1440" w:header="720" w:footer="720" w:gutter="0"/>
@@ -17330,7 +18206,6 @@
   <w:style w:type="character" w:default="1" w:styleId="DefaultParagraphFont">
     <w:name w:val="Default Paragraph Font"/>
     <w:uiPriority w:val="1"/>
-    <w:semiHidden/>
     <w:unhideWhenUsed/>
   </w:style>
   <w:style w:type="table" w:default="1" w:styleId="TableNormal">
@@ -17644,6 +18519,25 @@
       <w:spacing w:val="5"/>
     </w:rPr>
   </w:style>
+  <w:style w:type="table" w:styleId="TableGrid">
+    <w:name w:val="Table Grid"/>
+    <w:basedOn w:val="TableNormal"/>
+    <w:uiPriority w:val="39"/>
+    <w:rsid w:val="00C36820"/>
+    <w:pPr>
+      <w:spacing w:after="0" w:line="240" w:lineRule="auto"/>
+    </w:pPr>
+    <w:tblPr>
+      <w:tblBorders>
+        <w:top w:val="single" w:sz="4" w:space="0" w:color="auto"/>
+        <w:left w:val="single" w:sz="4" w:space="0" w:color="auto"/>
+        <w:bottom w:val="single" w:sz="4" w:space="0" w:color="auto"/>
+        <w:right w:val="single" w:sz="4" w:space="0" w:color="auto"/>
+        <w:insideH w:val="single" w:sz="4" w:space="0" w:color="auto"/>
+        <w:insideV w:val="single" w:sz="4" w:space="0" w:color="auto"/>
+      </w:tblBorders>
+    </w:tblPr>
+  </w:style>
 </w:styles>
 </file>
 

</xml_diff>